<commit_message>
Reformat foundry report for submission requirements
Co-authored-by: Andrii Korzhov <Sferaved@users.noreply.github.com>
</commit_message>
<xml_diff>
--- a/foundry_osh_report/Referat_Orhanizatsiia_okhorony_pratsi_na_lyvarnomu_vyrobnytstvi.docx
+++ b/foundry_osh_report/Referat_Orhanizatsiia_okhorony_pratsi_na_lyvarnomu_vyrobnytstvi.docx
@@ -13,7 +13,7 @@
           <w:b w:val="0"/>
           <w:sz w:val="28"/>
         </w:rPr>
-        <w:t>Міністерство освіти і науки України</w:t>
+        <w:t>МІНІСТЕРСТВО НАУКИ І ОСВІТИ УКРАЇНИ</w:t>
       </w:r>
     </w:p>
     <w:p>
@@ -27,7 +27,7 @@
           <w:b w:val="0"/>
           <w:sz w:val="28"/>
         </w:rPr>
-        <w:t>Національний технічний університет «Харківський політехнічний інститут»</w:t>
+        <w:t>НАЦІОНАЛЬНИЙ ТЕХНІЧНИЙ УНІВЕРСИТЕТ</w:t>
       </w:r>
     </w:p>
     <w:p>
@@ -41,7 +41,7 @@
           <w:b w:val="0"/>
           <w:sz w:val="28"/>
         </w:rPr>
-        <w:t>Кафедра безпеки праці та навколишнього середовища</w:t>
+        <w:t>«ХАРКІВСЬКИЙ ПОЛІТЕХНІЧНИЙ ІНСТИТУТ»</w:t>
       </w:r>
     </w:p>
     <w:p>
@@ -55,6 +55,7 @@
           <w:b w:val="0"/>
           <w:sz w:val="28"/>
         </w:rPr>
+        <w:t>Кафедра «Безпека праці та навколишнього середовища»</w:t>
       </w:r>
     </w:p>
     <w:p>
@@ -68,6 +69,7 @@
           <w:b w:val="0"/>
           <w:sz w:val="28"/>
         </w:rPr>
+        <w:t>Безпека праці та професійної діяльності</w:t>
       </w:r>
     </w:p>
     <w:p>
@@ -131,38 +133,10 @@
       <w:r>
         <w:rPr>
           <w:rFonts w:ascii="Times New Roman" w:hAnsi="Times New Roman"/>
-          <w:b w:val="0"/>
-          <w:sz w:val="28"/>
-        </w:rPr>
-        <w:t>з дисципліни «Безпека праці та професійної діяльності»</w:t>
-      </w:r>
-    </w:p>
-    <w:p>
-      <w:pPr>
-        <w:spacing w:line="360" w:lineRule="auto" w:after="0"/>
-        <w:jc w:val="center"/>
-      </w:pPr>
-      <w:r>
-        <w:rPr>
-          <w:rFonts w:ascii="Times New Roman" w:hAnsi="Times New Roman"/>
-          <w:b w:val="0"/>
-          <w:sz w:val="28"/>
-        </w:rPr>
-        <w:t>на тему:</w:t>
-      </w:r>
-    </w:p>
-    <w:p>
-      <w:pPr>
-        <w:spacing w:line="360" w:lineRule="auto" w:after="0"/>
-        <w:jc w:val="center"/>
-      </w:pPr>
-      <w:r>
-        <w:rPr>
-          <w:rFonts w:ascii="Times New Roman" w:hAnsi="Times New Roman"/>
           <w:b/>
           <w:sz w:val="28"/>
         </w:rPr>
-        <w:t>«Організація охорони праці на ливарному виробництві»</w:t>
+        <w:t>Організація охорони праці на ливарному виробництві</w:t>
       </w:r>
     </w:p>
     <w:p>
@@ -241,7 +215,7 @@
           <w:b w:val="0"/>
           <w:sz w:val="28"/>
         </w:rPr>
-        <w:t>Виконав: студент групи ____________</w:t>
+        <w:t>Виконав: студент гр.</w:t>
       </w:r>
     </w:p>
     <w:p>
@@ -255,7 +229,7 @@
           <w:b w:val="0"/>
           <w:sz w:val="28"/>
         </w:rPr>
-        <w:t>ПІБ ______________________________</w:t>
+        <w:t>МІТ-М625 М. А. Коржов</w:t>
       </w:r>
     </w:p>
     <w:p>
@@ -269,7 +243,21 @@
           <w:b w:val="0"/>
           <w:sz w:val="28"/>
         </w:rPr>
-        <w:t>Перевірив: ________________________</w:t>
+        <w:t>Перевірив: професор</w:t>
+      </w:r>
+    </w:p>
+    <w:p>
+      <w:pPr>
+        <w:spacing w:line="360" w:lineRule="auto" w:after="0"/>
+        <w:jc w:val="right"/>
+      </w:pPr>
+      <w:r>
+        <w:rPr>
+          <w:rFonts w:ascii="Times New Roman" w:hAnsi="Times New Roman"/>
+          <w:b w:val="0"/>
+          <w:sz w:val="28"/>
+        </w:rPr>
+        <w:t>Мезенцева І. О.</w:t>
       </w:r>
     </w:p>
     <w:p>
@@ -322,6 +310,7 @@
           <w:b w:val="0"/>
           <w:sz w:val="28"/>
         </w:rPr>
+        <w:t>Харків</w:t>
       </w:r>
     </w:p>
     <w:p>
@@ -335,6 +324,7 @@
           <w:b w:val="0"/>
           <w:sz w:val="28"/>
         </w:rPr>
+        <w:t>НТУ «ХПІ»</w:t>
       </w:r>
     </w:p>
     <w:p>
@@ -348,13 +338,18 @@
           <w:b w:val="0"/>
           <w:sz w:val="28"/>
         </w:rPr>
-        <w:t>Харків 2026</w:t>
+        <w:t>2026</w:t>
       </w:r>
     </w:p>
     <w:p>
-      <w:r>
-        <w:br w:type="page"/>
-      </w:r>
+      <w:pPr>
+        <w:sectPr>
+          <w:pgSz w:w="12240" w:h="15840"/>
+          <w:pgMar w:top="1134" w:right="850" w:bottom="1134" w:left="1701" w:header="720" w:footer="720" w:gutter="0"/>
+          <w:cols w:space="720"/>
+          <w:docGrid w:linePitch="360"/>
+        </w:sectPr>
+      </w:pPr>
     </w:p>
     <w:p>
       <w:pPr>
@@ -381,7 +376,9 @@
           <w:b w:val="0"/>
           <w:sz w:val="28"/>
         </w:rPr>
-        <w:t>Вступ ........................................................................</w:t>
+        <w:t>ВСТУП</w:t>
+        <w:tab/>
+        <w:t>1</w:t>
       </w:r>
     </w:p>
     <w:p>
@@ -395,7 +392,9 @@
           <w:b w:val="0"/>
           <w:sz w:val="28"/>
         </w:rPr>
-        <w:t>1. Нормативно-правова база охорони праці у ливарному виробництві ........................................................................</w:t>
+        <w:t>1. НОРМАТИВНО-ПРАВОВА БАЗА ОХОРОНИ ПРАЦІ У ЛИВАРНОМУ ВИРОБНИЦТВІ</w:t>
+        <w:tab/>
+        <w:t>2</w:t>
       </w:r>
     </w:p>
     <w:p>
@@ -409,7 +408,9 @@
           <w:b w:val="0"/>
           <w:sz w:val="28"/>
         </w:rPr>
-        <w:t>2. Характеристика ливарного виробництва як об'єкта підвищеної небезпеки ........................................................................</w:t>
+        <w:t>2. ХАРАКТЕРИСТИКА ЛИВАРНОГО ВИРОБНИЦТВА ЯК ОБ'ЄКТА ПІДВИЩЕНОЇ НЕБЕЗПЕКИ</w:t>
+        <w:tab/>
+        <w:t>3</w:t>
       </w:r>
     </w:p>
     <w:p>
@@ -423,7 +424,9 @@
           <w:b w:val="0"/>
           <w:sz w:val="28"/>
         </w:rPr>
-        <w:t>3. Основні небезпечні та шкідливі виробничі фактори ........................................................................</w:t>
+        <w:t>3. ОСНОВНІ НЕБЕЗПЕЧНІ ТА ШКІДЛИВІ ВИРОБНИЧІ ФАКТОРИ</w:t>
+        <w:tab/>
+        <w:t>4</w:t>
       </w:r>
     </w:p>
     <w:p>
@@ -437,7 +440,9 @@
           <w:b w:val="0"/>
           <w:sz w:val="28"/>
         </w:rPr>
-        <w:t>4. Система управління охороною праці на ливарному підприємстві ........................................................................</w:t>
+        <w:t>4. СИСТЕМА УПРАВЛІННЯ ОХОРОНОЮ ПРАЦІ НА ЛИВАРНОМУ ПІДПРИЄМСТВІ</w:t>
+        <w:tab/>
+        <w:t>5</w:t>
       </w:r>
     </w:p>
     <w:p>
@@ -451,7 +456,9 @@
           <w:b w:val="0"/>
           <w:sz w:val="28"/>
         </w:rPr>
-        <w:t>5. Оцінка професійних ризиків і атестація робочих місць ........................................................................</w:t>
+        <w:t>5. ОЦІНКА ПРОФЕСІЙНИХ РИЗИКІВ І АТЕСТАЦІЯ РОБОЧИХ МІСЦЬ</w:t>
+        <w:tab/>
+        <w:t>6</w:t>
       </w:r>
     </w:p>
     <w:p>
@@ -465,7 +472,9 @@
           <w:b w:val="0"/>
           <w:sz w:val="28"/>
         </w:rPr>
-        <w:t>6. Організація безпечних технологічних процесів ........................................................................</w:t>
+        <w:t>6. ОРГАНІЗАЦІЯ БЕЗПЕЧНИХ ТЕХНОЛОГІЧНИХ ПРОЦЕСІВ</w:t>
+        <w:tab/>
+        <w:t>7</w:t>
       </w:r>
     </w:p>
     <w:p>
@@ -479,7 +488,9 @@
           <w:b w:val="0"/>
           <w:sz w:val="28"/>
         </w:rPr>
-        <w:t>7. Виробнича санітарія, вентиляція та мікроклімат ........................................................................</w:t>
+        <w:t>7. ВИРОБНИЧА САНІТАРІЯ, ВЕНТИЛЯЦІЯ ТА МІКРОКЛІМАТ</w:t>
+        <w:tab/>
+        <w:t>8</w:t>
       </w:r>
     </w:p>
     <w:p>
@@ -493,7 +504,9 @@
           <w:b w:val="0"/>
           <w:sz w:val="28"/>
         </w:rPr>
-        <w:t>8. Пожежна, вибухова та електробезпека ........................................................................</w:t>
+        <w:t>8. ПОЖЕЖНА, ВИБУХОВА ТА ЕЛЕКТРОБЕЗПЕКА</w:t>
+        <w:tab/>
+        <w:t>9</w:t>
       </w:r>
     </w:p>
     <w:p>
@@ -507,7 +520,9 @@
           <w:b w:val="0"/>
           <w:sz w:val="28"/>
         </w:rPr>
-        <w:t>9. Засоби колективного та індивідуального захисту ........................................................................</w:t>
+        <w:t>9. ЗАСОБИ КОЛЕКТИВНОГО ТА ІНДИВІДУАЛЬНОГО ЗАХИСТУ</w:t>
+        <w:tab/>
+        <w:t>10</w:t>
       </w:r>
     </w:p>
     <w:p>
@@ -521,7 +536,9 @@
           <w:b w:val="0"/>
           <w:sz w:val="28"/>
         </w:rPr>
-        <w:t>10. Навчання, інструктажі та допуск до робіт ........................................................................</w:t>
+        <w:t>10. НАВЧАННЯ, ІНСТРУКТАЖІ ТА ДОПУСК ДО РОБІТ</w:t>
+        <w:tab/>
+        <w:t>11</w:t>
       </w:r>
     </w:p>
     <w:p>
@@ -535,7 +552,9 @@
           <w:b w:val="0"/>
           <w:sz w:val="28"/>
         </w:rPr>
-        <w:t>11. Медичні огляди, режим праці та профілактика професійних захворювань ........................................................................</w:t>
+        <w:t>11. МЕДИЧНІ ОГЛЯДИ, РЕЖИМ ПРАЦІ ТА ПРОФІЛАКТИКА ПРОФЕСІЙНИХ ЗАХВОРЮВАНЬ</w:t>
+        <w:tab/>
+        <w:t>12</w:t>
       </w:r>
     </w:p>
     <w:p>
@@ -549,7 +568,9 @@
           <w:b w:val="0"/>
           <w:sz w:val="28"/>
         </w:rPr>
-        <w:t>12. Аварійна готовність і перша допомога ........................................................................</w:t>
+        <w:t>12. АВАРІЙНА ГОТОВНІСТЬ І ПЕРША ДОПОМОГА</w:t>
+        <w:tab/>
+        <w:t>13</w:t>
       </w:r>
     </w:p>
     <w:p>
@@ -563,7 +584,9 @@
           <w:b w:val="0"/>
           <w:sz w:val="28"/>
         </w:rPr>
-        <w:t>13. Напрями удосконалення організації охорони праці ........................................................................</w:t>
+        <w:t>13. НАПРЯМИ УДОСКОНАЛЕННЯ ОРГАНІЗАЦІЇ ОХОРОНИ ПРАЦІ</w:t>
+        <w:tab/>
+        <w:t>14</w:t>
       </w:r>
     </w:p>
     <w:p>
@@ -577,7 +600,9 @@
           <w:b w:val="0"/>
           <w:sz w:val="28"/>
         </w:rPr>
-        <w:t>14. Документація та контроль стану охорони праці ........................................................................</w:t>
+        <w:t>14. ДОКУМЕНТАЦІЯ ТА КОНТРОЛЬ СТАНУ ОХОРОНИ ПРАЦІ</w:t>
+        <w:tab/>
+        <w:t>14</w:t>
       </w:r>
     </w:p>
     <w:p>
@@ -591,7 +616,9 @@
           <w:b w:val="0"/>
           <w:sz w:val="28"/>
         </w:rPr>
-        <w:t>15. Організація робочих місць і виробничої логістики ........................................................................</w:t>
+        <w:t>15. ОРГАНІЗАЦІЯ РОБОЧИХ МІСЦЬ І ВИРОБНИЧОЇ ЛОГІСТИКИ</w:t>
+        <w:tab/>
+        <w:t>16</w:t>
       </w:r>
     </w:p>
     <w:p>
@@ -605,7 +632,9 @@
           <w:b w:val="0"/>
           <w:sz w:val="28"/>
         </w:rPr>
-        <w:t>16. Типові порушення та профілактичні заходи ........................................................................</w:t>
+        <w:t>16. ТИПОВІ ПОРУШЕННЯ ТА ПРОФІЛАКТИЧНІ ЗАХОДИ</w:t>
+        <w:tab/>
+        <w:t>17</w:t>
       </w:r>
     </w:p>
     <w:p>
@@ -619,7 +648,9 @@
           <w:b w:val="0"/>
           <w:sz w:val="28"/>
         </w:rPr>
-        <w:t>17. Орієнтовний план заходів з поліпшення охорони праці ........................................................................</w:t>
+        <w:t>17. ОРІЄНТОВНИЙ ПЛАН ЗАХОДІВ З ПОЛІПШЕННЯ ОХОРОНИ ПРАЦІ</w:t>
+        <w:tab/>
+        <w:t>18</w:t>
       </w:r>
     </w:p>
     <w:p>
@@ -633,7 +664,9 @@
           <w:b w:val="0"/>
           <w:sz w:val="28"/>
         </w:rPr>
-        <w:t>Висновки ........................................................................</w:t>
+        <w:t>ВИСНОВКИ</w:t>
+        <w:tab/>
+        <w:t>19</w:t>
       </w:r>
     </w:p>
     <w:p>
@@ -647,18 +680,15 @@
           <w:b w:val="0"/>
           <w:sz w:val="28"/>
         </w:rPr>
-        <w:t>Список використаних джерел ........................................................................</w:t>
+        <w:t>СПИСОК ВИКОРИСТАНИХ ДЖЕРЕЛ</w:t>
+        <w:tab/>
+        <w:t>20</w:t>
       </w:r>
     </w:p>
     <w:p>
-      <w:r>
-        <w:br w:type="page"/>
-      </w:r>
-    </w:p>
-    <w:p>
       <w:pPr>
         <w:spacing w:line="360" w:lineRule="auto" w:after="0"/>
-        <w:jc w:val="center"/>
+        <w:jc w:val="left"/>
       </w:pPr>
       <w:r>
         <w:rPr>
@@ -730,14 +760,9 @@
       </w:r>
     </w:p>
     <w:p>
-      <w:r>
-        <w:br w:type="page"/>
-      </w:r>
-    </w:p>
-    <w:p>
       <w:pPr>
         <w:spacing w:line="360" w:lineRule="auto" w:after="0"/>
-        <w:jc w:val="center"/>
+        <w:jc w:val="left"/>
       </w:pPr>
       <w:r>
         <w:rPr>
@@ -826,21 +851,7 @@
     <w:p>
       <w:pPr>
         <w:spacing w:line="360" w:lineRule="auto" w:after="0"/>
-        <w:ind w:firstLine="709"/>
-        <w:jc w:val="both"/>
-      </w:pPr>
-      <w:r>
-        <w:rPr>
-          <w:rFonts w:ascii="Times New Roman" w:hAnsi="Times New Roman"/>
-          <w:b w:val="0"/>
-          <w:sz w:val="28"/>
-        </w:rPr>
-      </w:r>
-    </w:p>
-    <w:p>
-      <w:pPr>
-        <w:spacing w:line="360" w:lineRule="auto" w:after="0"/>
-        <w:jc w:val="center"/>
+        <w:jc w:val="left"/>
       </w:pPr>
       <w:r>
         <w:rPr>
@@ -929,26 +940,7 @@
     <w:p>
       <w:pPr>
         <w:spacing w:line="360" w:lineRule="auto" w:after="0"/>
-        <w:ind w:firstLine="709"/>
-        <w:jc w:val="both"/>
-      </w:pPr>
-      <w:r>
-        <w:rPr>
-          <w:rFonts w:ascii="Times New Roman" w:hAnsi="Times New Roman"/>
-          <w:b w:val="0"/>
-          <w:sz w:val="28"/>
-        </w:rPr>
-      </w:r>
-    </w:p>
-    <w:p>
-      <w:r>
-        <w:br w:type="page"/>
-      </w:r>
-    </w:p>
-    <w:p>
-      <w:pPr>
-        <w:spacing w:line="360" w:lineRule="auto" w:after="0"/>
-        <w:jc w:val="center"/>
+        <w:jc w:val="left"/>
       </w:pPr>
       <w:r>
         <w:rPr>
@@ -1037,21 +1029,7 @@
     <w:p>
       <w:pPr>
         <w:spacing w:line="360" w:lineRule="auto" w:after="0"/>
-        <w:ind w:firstLine="709"/>
-        <w:jc w:val="both"/>
-      </w:pPr>
-      <w:r>
-        <w:rPr>
-          <w:rFonts w:ascii="Times New Roman" w:hAnsi="Times New Roman"/>
-          <w:b w:val="0"/>
-          <w:sz w:val="28"/>
-        </w:rPr>
-      </w:r>
-    </w:p>
-    <w:p>
-      <w:pPr>
-        <w:spacing w:line="360" w:lineRule="auto" w:after="0"/>
-        <w:jc w:val="center"/>
+        <w:jc w:val="left"/>
       </w:pPr>
       <w:r>
         <w:rPr>
@@ -1140,26 +1118,7 @@
     <w:p>
       <w:pPr>
         <w:spacing w:line="360" w:lineRule="auto" w:after="0"/>
-        <w:ind w:firstLine="709"/>
-        <w:jc w:val="both"/>
-      </w:pPr>
-      <w:r>
-        <w:rPr>
-          <w:rFonts w:ascii="Times New Roman" w:hAnsi="Times New Roman"/>
-          <w:b w:val="0"/>
-          <w:sz w:val="28"/>
-        </w:rPr>
-      </w:r>
-    </w:p>
-    <w:p>
-      <w:r>
-        <w:br w:type="page"/>
-      </w:r>
-    </w:p>
-    <w:p>
-      <w:pPr>
-        <w:spacing w:line="360" w:lineRule="auto" w:after="0"/>
-        <w:jc w:val="center"/>
+        <w:jc w:val="left"/>
       </w:pPr>
       <w:r>
         <w:rPr>
@@ -1248,21 +1207,7 @@
     <w:p>
       <w:pPr>
         <w:spacing w:line="360" w:lineRule="auto" w:after="0"/>
-        <w:ind w:firstLine="709"/>
-        <w:jc w:val="both"/>
-      </w:pPr>
-      <w:r>
-        <w:rPr>
-          <w:rFonts w:ascii="Times New Roman" w:hAnsi="Times New Roman"/>
-          <w:b w:val="0"/>
-          <w:sz w:val="28"/>
-        </w:rPr>
-      </w:r>
-    </w:p>
-    <w:p>
-      <w:pPr>
-        <w:spacing w:line="360" w:lineRule="auto" w:after="0"/>
-        <w:jc w:val="center"/>
+        <w:jc w:val="left"/>
       </w:pPr>
       <w:r>
         <w:rPr>
@@ -1351,26 +1296,7 @@
     <w:p>
       <w:pPr>
         <w:spacing w:line="360" w:lineRule="auto" w:after="0"/>
-        <w:ind w:firstLine="709"/>
-        <w:jc w:val="both"/>
-      </w:pPr>
-      <w:r>
-        <w:rPr>
-          <w:rFonts w:ascii="Times New Roman" w:hAnsi="Times New Roman"/>
-          <w:b w:val="0"/>
-          <w:sz w:val="28"/>
-        </w:rPr>
-      </w:r>
-    </w:p>
-    <w:p>
-      <w:r>
-        <w:br w:type="page"/>
-      </w:r>
-    </w:p>
-    <w:p>
-      <w:pPr>
-        <w:spacing w:line="360" w:lineRule="auto" w:after="0"/>
-        <w:jc w:val="center"/>
+        <w:jc w:val="left"/>
       </w:pPr>
       <w:r>
         <w:rPr>
@@ -1459,21 +1385,7 @@
     <w:p>
       <w:pPr>
         <w:spacing w:line="360" w:lineRule="auto" w:after="0"/>
-        <w:ind w:firstLine="709"/>
-        <w:jc w:val="both"/>
-      </w:pPr>
-      <w:r>
-        <w:rPr>
-          <w:rFonts w:ascii="Times New Roman" w:hAnsi="Times New Roman"/>
-          <w:b w:val="0"/>
-          <w:sz w:val="28"/>
-        </w:rPr>
-      </w:r>
-    </w:p>
-    <w:p>
-      <w:pPr>
-        <w:spacing w:line="360" w:lineRule="auto" w:after="0"/>
-        <w:jc w:val="center"/>
+        <w:jc w:val="left"/>
       </w:pPr>
       <w:r>
         <w:rPr>
@@ -1562,26 +1474,7 @@
     <w:p>
       <w:pPr>
         <w:spacing w:line="360" w:lineRule="auto" w:after="0"/>
-        <w:ind w:firstLine="709"/>
-        <w:jc w:val="both"/>
-      </w:pPr>
-      <w:r>
-        <w:rPr>
-          <w:rFonts w:ascii="Times New Roman" w:hAnsi="Times New Roman"/>
-          <w:b w:val="0"/>
-          <w:sz w:val="28"/>
-        </w:rPr>
-      </w:r>
-    </w:p>
-    <w:p>
-      <w:r>
-        <w:br w:type="page"/>
-      </w:r>
-    </w:p>
-    <w:p>
-      <w:pPr>
-        <w:spacing w:line="360" w:lineRule="auto" w:after="0"/>
-        <w:jc w:val="center"/>
+        <w:jc w:val="left"/>
       </w:pPr>
       <w:r>
         <w:rPr>
@@ -1670,21 +1563,7 @@
     <w:p>
       <w:pPr>
         <w:spacing w:line="360" w:lineRule="auto" w:after="0"/>
-        <w:ind w:firstLine="709"/>
-        <w:jc w:val="both"/>
-      </w:pPr>
-      <w:r>
-        <w:rPr>
-          <w:rFonts w:ascii="Times New Roman" w:hAnsi="Times New Roman"/>
-          <w:b w:val="0"/>
-          <w:sz w:val="28"/>
-        </w:rPr>
-      </w:r>
-    </w:p>
-    <w:p>
-      <w:pPr>
-        <w:spacing w:line="360" w:lineRule="auto" w:after="0"/>
-        <w:jc w:val="center"/>
+        <w:jc w:val="left"/>
       </w:pPr>
       <w:r>
         <w:rPr>
@@ -1773,26 +1652,7 @@
     <w:p>
       <w:pPr>
         <w:spacing w:line="360" w:lineRule="auto" w:after="0"/>
-        <w:ind w:firstLine="709"/>
-        <w:jc w:val="both"/>
-      </w:pPr>
-      <w:r>
-        <w:rPr>
-          <w:rFonts w:ascii="Times New Roman" w:hAnsi="Times New Roman"/>
-          <w:b w:val="0"/>
-          <w:sz w:val="28"/>
-        </w:rPr>
-      </w:r>
-    </w:p>
-    <w:p>
-      <w:r>
-        <w:br w:type="page"/>
-      </w:r>
-    </w:p>
-    <w:p>
-      <w:pPr>
-        <w:spacing w:line="360" w:lineRule="auto" w:after="0"/>
-        <w:jc w:val="center"/>
+        <w:jc w:val="left"/>
       </w:pPr>
       <w:r>
         <w:rPr>
@@ -1881,21 +1741,7 @@
     <w:p>
       <w:pPr>
         <w:spacing w:line="360" w:lineRule="auto" w:after="0"/>
-        <w:ind w:firstLine="709"/>
-        <w:jc w:val="both"/>
-      </w:pPr>
-      <w:r>
-        <w:rPr>
-          <w:rFonts w:ascii="Times New Roman" w:hAnsi="Times New Roman"/>
-          <w:b w:val="0"/>
-          <w:sz w:val="28"/>
-        </w:rPr>
-      </w:r>
-    </w:p>
-    <w:p>
-      <w:pPr>
-        <w:spacing w:line="360" w:lineRule="auto" w:after="0"/>
-        <w:jc w:val="center"/>
+        <w:jc w:val="left"/>
       </w:pPr>
       <w:r>
         <w:rPr>
@@ -1984,26 +1830,7 @@
     <w:p>
       <w:pPr>
         <w:spacing w:line="360" w:lineRule="auto" w:after="0"/>
-        <w:ind w:firstLine="709"/>
-        <w:jc w:val="both"/>
-      </w:pPr>
-      <w:r>
-        <w:rPr>
-          <w:rFonts w:ascii="Times New Roman" w:hAnsi="Times New Roman"/>
-          <w:b w:val="0"/>
-          <w:sz w:val="28"/>
-        </w:rPr>
-      </w:r>
-    </w:p>
-    <w:p>
-      <w:r>
-        <w:br w:type="page"/>
-      </w:r>
-    </w:p>
-    <w:p>
-      <w:pPr>
-        <w:spacing w:line="360" w:lineRule="auto" w:after="0"/>
-        <w:jc w:val="center"/>
+        <w:jc w:val="left"/>
       </w:pPr>
       <w:r>
         <w:rPr>
@@ -2092,21 +1919,7 @@
     <w:p>
       <w:pPr>
         <w:spacing w:line="360" w:lineRule="auto" w:after="0"/>
-        <w:ind w:firstLine="709"/>
-        <w:jc w:val="both"/>
-      </w:pPr>
-      <w:r>
-        <w:rPr>
-          <w:rFonts w:ascii="Times New Roman" w:hAnsi="Times New Roman"/>
-          <w:b w:val="0"/>
-          <w:sz w:val="28"/>
-        </w:rPr>
-      </w:r>
-    </w:p>
-    <w:p>
-      <w:pPr>
-        <w:spacing w:line="360" w:lineRule="auto" w:after="0"/>
-        <w:jc w:val="center"/>
+        <w:jc w:val="left"/>
       </w:pPr>
       <w:r>
         <w:rPr>
@@ -2210,26 +2023,7 @@
     <w:p>
       <w:pPr>
         <w:spacing w:line="360" w:lineRule="auto" w:after="0"/>
-        <w:ind w:firstLine="709"/>
-        <w:jc w:val="both"/>
-      </w:pPr>
-      <w:r>
-        <w:rPr>
-          <w:rFonts w:ascii="Times New Roman" w:hAnsi="Times New Roman"/>
-          <w:b w:val="0"/>
-          <w:sz w:val="28"/>
-        </w:rPr>
-      </w:r>
-    </w:p>
-    <w:p>
-      <w:r>
-        <w:br w:type="page"/>
-      </w:r>
-    </w:p>
-    <w:p>
-      <w:pPr>
-        <w:spacing w:line="360" w:lineRule="auto" w:after="0"/>
-        <w:jc w:val="center"/>
+        <w:jc w:val="left"/>
       </w:pPr>
       <w:r>
         <w:rPr>
@@ -2333,21 +2127,7 @@
     <w:p>
       <w:pPr>
         <w:spacing w:line="360" w:lineRule="auto" w:after="0"/>
-        <w:ind w:firstLine="709"/>
-        <w:jc w:val="both"/>
-      </w:pPr>
-      <w:r>
-        <w:rPr>
-          <w:rFonts w:ascii="Times New Roman" w:hAnsi="Times New Roman"/>
-          <w:b w:val="0"/>
-          <w:sz w:val="28"/>
-        </w:rPr>
-      </w:r>
-    </w:p>
-    <w:p>
-      <w:pPr>
-        <w:spacing w:line="360" w:lineRule="auto" w:after="0"/>
-        <w:jc w:val="center"/>
+        <w:jc w:val="left"/>
       </w:pPr>
       <w:r>
         <w:rPr>
@@ -2451,26 +2231,7 @@
     <w:p>
       <w:pPr>
         <w:spacing w:line="360" w:lineRule="auto" w:after="0"/>
-        <w:ind w:firstLine="709"/>
-        <w:jc w:val="both"/>
-      </w:pPr>
-      <w:r>
-        <w:rPr>
-          <w:rFonts w:ascii="Times New Roman" w:hAnsi="Times New Roman"/>
-          <w:b w:val="0"/>
-          <w:sz w:val="28"/>
-        </w:rPr>
-      </w:r>
-    </w:p>
-    <w:p>
-      <w:r>
-        <w:br w:type="page"/>
-      </w:r>
-    </w:p>
-    <w:p>
-      <w:pPr>
-        <w:spacing w:line="360" w:lineRule="auto" w:after="0"/>
-        <w:jc w:val="center"/>
+        <w:jc w:val="left"/>
       </w:pPr>
       <w:r>
         <w:rPr>
@@ -2574,21 +2335,7 @@
     <w:p>
       <w:pPr>
         <w:spacing w:line="360" w:lineRule="auto" w:after="0"/>
-        <w:ind w:firstLine="709"/>
-        <w:jc w:val="both"/>
-      </w:pPr>
-      <w:r>
-        <w:rPr>
-          <w:rFonts w:ascii="Times New Roman" w:hAnsi="Times New Roman"/>
-          <w:b w:val="0"/>
-          <w:sz w:val="28"/>
-        </w:rPr>
-      </w:r>
-    </w:p>
-    <w:p>
-      <w:pPr>
-        <w:spacing w:line="360" w:lineRule="auto" w:after="0"/>
-        <w:jc w:val="center"/>
+        <w:jc w:val="left"/>
       </w:pPr>
       <w:r>
         <w:rPr>
@@ -2677,7 +2424,7 @@
     <w:p>
       <w:pPr>
         <w:spacing w:line="360" w:lineRule="auto" w:after="0"/>
-        <w:jc w:val="center"/>
+        <w:jc w:val="left"/>
       </w:pPr>
       <w:r>
         <w:rPr>
@@ -2834,6 +2581,7 @@
       <w:pgMar w:top="1134" w:right="850" w:bottom="1134" w:left="1701" w:header="720" w:footer="720" w:gutter="0"/>
       <w:cols w:space="720"/>
       <w:docGrid w:linePitch="360"/>
+      <w:pgNumType w:start="1"/>
     </w:sectPr>
   </w:body>
 </w:document>

</xml_diff>